<commit_message>
Finalize KBS short communication manuscript
</commit_message>
<xml_diff>
--- a/KBS_short_communication_manuscript.docx
+++ b/KBS_short_communication_manuscript.docx
@@ -26,7 +26,7 @@
           <w:rFonts w:ascii="Times New Roman" w:hAnsi="Times New Roman"/>
           <w:sz w:val="22"/>
         </w:rPr>
-        <w:t>Nithish Maley</w:t>
+        <w:t>Nithish Kumar Maley</w:t>
       </w:r>
     </w:p>
     <w:p>
@@ -53,7 +53,7 @@
           <w:rFonts w:ascii="Times New Roman" w:hAnsi="Times New Roman"/>
           <w:sz w:val="22"/>
         </w:rPr>
-        <w:t>Affiliation: [Insert institution and postal address]</w:t>
+        <w:t>Affiliation: Doctorate of Business Administration (DBA) Program, Midwest University, 851 Parr Rd, Wentzville, MO 63385, USA</w:t>
       </w:r>
     </w:p>
     <w:p>
@@ -66,7 +66,7 @@
           <w:rFonts w:ascii="Times New Roman" w:hAnsi="Times New Roman"/>
           <w:sz w:val="22"/>
         </w:rPr>
-        <w:t>Corresponding author: [Insert corresponding-author e-mail]</w:t>
+        <w:t>Corresponding author: nithish.maley4603@gmail.com</w:t>
       </w:r>
     </w:p>
     <w:p>
@@ -218,7 +218,7 @@
           <w:rFonts w:ascii="Times New Roman" w:hAnsi="Times New Roman"/>
           <w:sz w:val="22"/>
         </w:rPr>
-        <w:t>Digital transformation changes how organizations create value, organize work, and engage with customers [1]. For entrepreneurs and innovation managers, the decision is rarely whether a digital technology exists. The practical decision is which opportunity should be pursued, with which resources, and under which constraints. Market demand, customer need, data readiness, organizational capability, regulatory exposure, and implementation complexity all influence that decision. These signals are heterogeneous and often incomplete. A system that uses only historical data can identify associations, but it may overlook a policy constraint or a condition that business experts regard as non-negotiable.</w:t>
+        <w:t>Digital transformation changes how organizations create value, organize work, and engage with customers [1,2]. For entrepreneurs and innovation managers, the decision is rarely whether a digital technology exists. The practical decision is which opportunity should be pursued, with which resources, and under which constraints. Market demand, customer need, data readiness, organizational capability, regulatory exposure, and implementation complexity all influence that decision. These signals are heterogeneous and often incomplete [5,6]. A system that uses only historical data can identify associations, but it may overlook a policy constraint or a condition that business experts regard as non-negotiable.</w:t>
       </w:r>
     </w:p>
     <w:p>
@@ -232,7 +232,7 @@
           <w:rFonts w:ascii="Times New Roman" w:hAnsi="Times New Roman"/>
           <w:sz w:val="22"/>
         </w:rPr>
-        <w:t>Digital entrepreneurship is shaped by the interaction between digital technologies and entrepreneurial processes [2]. This interaction creates a knowledge problem as well as a prediction problem. A decision-support system must use available observations while also representing relationships, thresholds, and constraints that are meaningful to the organization. Knowledge-based systems are well suited to this combination because they can encode domain concepts and reasoning procedures alongside computational models. The KBS aims and scope include data science, knowledge representation and engineering, intelligent decision-support systems, prediction systems, and business applications. The framework proposed here addresses these topics through a focused opportunity-assessment task.</w:t>
+        <w:t>Digital entrepreneurship is shaped by the interaction between digital technologies and entrepreneurial processes [3]. This interaction creates a knowledge problem as well as a prediction problem. A decision-support system must use available observations while also representing relationships, thresholds, and constraints that are meaningful to the organization. Knowledge-based systems are well suited to this combination because they can encode domain concepts and reasoning procedures alongside computational models [9,10]. The KBS aims and scope include data science, knowledge representation and engineering, intelligent decision-support systems, prediction systems, and business applications. The framework proposed here addresses these topics through a focused opportunity-assessment task.</w:t>
       </w:r>
     </w:p>
     <w:p>
@@ -246,7 +246,7 @@
           <w:rFonts w:ascii="Times New Roman" w:hAnsi="Times New Roman"/>
           <w:sz w:val="22"/>
         </w:rPr>
-        <w:t>Artificial intelligence can support managers by augmenting analysis and expanding the range of alternatives considered [3]. However, AI-supported recommendations are difficult to use when a manager cannot understand why an opportunity was ranked highly or why a recommendation was blocked. Explainability is therefore treated as a design requirement rather than an after-the-fact visualization [4]. The aim of this Short Communication is to present a compact hybrid method that joins a data model with an explicit knowledge layer and produces both a decision score and an explanation.</w:t>
+        <w:t>Artificial intelligence can support managers by augmenting analysis and expanding the range of alternatives considered [4,5,6]. However, AI-supported recommendations are difficult to use when a manager cannot understand why an opportunity was ranked highly or why a recommendation was blocked. Explainability is therefore treated as a design requirement rather than an after-the-fact visualization [8-11]. The aim of this Short Communication is to present a compact hybrid method that joins a data model with an explicit knowledge layer and produces both a decision score and an explanation.</w:t>
       </w:r>
     </w:p>
     <w:p>
@@ -376,7 +376,7 @@
           <w:rFonts w:ascii="Times New Roman" w:hAnsi="Times New Roman"/>
           <w:sz w:val="22"/>
         </w:rPr>
-        <w:t>The framework is not intended to replace entrepreneurial judgment. It provides a repeatable screening layer that helps a decision-maker compare opportunities, identify missing capabilities, and see where a recommendation depends on a constraint. This human-in-the-loop orientation is consistent with the view that AI can automate portions of a process while leaving judgment and responsibility with managers [3].</w:t>
+        <w:t>The framework is not intended to replace entrepreneurial judgment. It provides a repeatable screening layer that helps a decision-maker compare opportunities, identify missing capabilities, and see where a recommendation depends on a constraint. This human-in-the-loop orientation is consistent with research on augmentation, explainable decision support, and responsible AI [4,10,11].</w:t>
       </w:r>
     </w:p>
     <w:p>
@@ -463,7 +463,7 @@
           <w:rFonts w:ascii="Times New Roman" w:hAnsi="Times New Roman"/>
           <w:sz w:val="22"/>
         </w:rPr>
-        <w:t xml:space="preserve"> represent useful combinations, such as the joint presence of market demand and innovation novelty. In the executable benchmark, the low-readiness gate is activated when data readiness is below 0.22 and digital maturity is below 0.25; the regulatory gate is activated when regulatory exposure exceeds 0.82 while data readiness is below 0.45; and the market-novelty synergy is activated when market signal exceeds 0.62 and innovation novelty exceeds 0.68. The knowledge layer can be implemented as a rules table, lightweight ontology, or knowledge graph. The important property is that the reasoning structure remains inspectable and can be revised independently from the statistical model.</w:t>
+        <w:t xml:space="preserve"> represent useful combinations, such as the joint presence of market demand and innovation novelty. In the executable benchmark, the low-readiness gate is activated when data readiness is below 0.22 and digital maturity is below 0.25; the regulatory gate is activated when regulatory exposure exceeds 0.82 while data readiness is below 0.45; and the market-novelty synergy is activated when market signal exceeds 0.62 and innovation novelty exceeds 0.68. The knowledge layer can be implemented as a rules table, lightweight ontology, or knowledge graph. Such representations support explicit semantics and limited-interaction reasoning in decision workflows [9]. The important property is that the reasoning structure remains inspectable and can be revised independently from the statistical model.</w:t>
       </w:r>
     </w:p>
     <w:p>
@@ -523,7 +523,7 @@
         <w:jc w:val="both"/>
       </w:pPr>
       <w:r>
-        <w:t>where 0 ≤ α ≤ 1. The demonstration uses α = 0.65; the sensitivity curve in Fig. 2 shows how the blend behaves across the full range. In an applied study, α should be selected on validation data. The knowledge score uses the weighted criteria and thresholds in Section 2.2, adds 0.10 for the market-novelty synergy, subtracts 0.32 when either hard gate is active, and maps the resulting score z_KB to the closed interval 0 to 1 with clip((z_KB + 0.20)/1.10, 0, 1). A rule trace records the conditions that contributed to the score. The final output contains (i) a ranked opportunity score, (ii) the data-model probability, (iii) the knowledge score, and (iv) the activated rules.</w:t>
+        <w:t>where 0 ≤ α ≤ 1. The demonstration uses α = 0.65; a separate alpha-sensitivity sweep is included in the reproducibility outputs. In an applied study, α should be selected on validation data. The knowledge score uses the weighted criteria and thresholds in Section 2.2, adds 0.10 for the market-novelty synergy, subtracts 0.32 when either hard gate is active, and maps the resulting score z_KB to the closed interval 0 to 1 with clip((z_KB + 0.20)/1.10, 0, 1). A rule trace records the conditions that contributed to the score. The final output contains (i) a ranked opportunity score, (ii) the data-model probability, (iii) the knowledge score, and (iv) the activated rules.</w:t>
       </w:r>
     </w:p>
     <w:p>
@@ -533,11 +533,7 @@
         <w:jc w:val="both"/>
       </w:pPr>
       <w:r>
-        <w:rPr>
-          <w:rFonts w:ascii="Times New Roman" w:hAnsi="Times New Roman"/>
-          <w:sz w:val="22"/>
-        </w:rPr>
-        <w:t>Figure 1 shows the information flow. Business data and organizational knowledge enter the hybrid AI layer separately, which prevents the knowledge structure from being hidden inside an opaque model. The resulting score can be connected to an innovation portfolio review, a digital-transformation roadmap, or an entrepreneurial opportunity-screening process.</w:t>
+        <w:t>Figure 1 provides a data-audit view of the controlled benchmark. The ten input indicators are almost uncorrelated with one another, while the simulated adoption outcome is most positively associated with market signal (r = 0.24), customer need (r = 0.16), and data readiness (r = 0.15), and negatively associated with regulatory exposure (r = -0.12) and implementation complexity (r = -0.11). This pattern is consistent with an opportunity-screening setting in which the knowledge layer adds explicit thresholds and interactions rather than merely duplicating redundant inputs. The heatmap should be read as a diagnostic of the synthetic benchmark, not as an empirical claim about business data.</w:t>
       </w:r>
     </w:p>
     <w:p>
@@ -587,11 +583,10 @@
       </w:pPr>
       <w:r>
         <w:rPr>
-          <w:rFonts w:ascii="Times New Roman" w:hAnsi="Times New Roman"/>
           <w:i/>
-          <w:sz w:val="20"/>
+          <w:sz w:val="18"/>
         </w:rPr>
-        <w:t>Fig. 1. K-AIDE framework. Business data and explicit knowledge are combined in a hybrid inference layer that returns an opportunity score, rule trace, and decision-support output.</w:t>
+        <w:t>Fig. 1. Feature correlation heatmap for the ten normalized indicators and simulated adoption outcome. Values are Pearson correlations computed on the pooled 15,000-record synthetic benchmark; the heatmap is a reproducibility diagnostic, not evidence from an observed industry dataset.</w:t>
       </w:r>
     </w:p>
     <w:p>
@@ -718,7 +713,7 @@
           <w:rFonts w:ascii="Times New Roman" w:hAnsi="Times New Roman"/>
           <w:sz w:val="22"/>
         </w:rPr>
-        <w:t xml:space="preserve"> is a random forest trained on the ten indicators. Random forests are a useful baseline for a short proof of concept because they model nonlinear interactions without requiring a large neural architecture [5]. The implementation uses 350 trees, a minimum leaf size of 8, class-balanced weights, single-threaded execution, and the benchmark seed as the model seed. The </w:t>
+        <w:t xml:space="preserve"> is a random forest trained on the ten indicators. Random forests are a useful baseline for a short proof of concept because they model nonlinear interactions without requiring a large neural architecture [12]. The implementation uses 350 trees, a minimum leaf size of 8, class-balanced weights, single-threaded execution, and the benchmark seed as the model seed. The </w:t>
       </w:r>
       <w:r>
         <w:rPr>
@@ -748,7 +743,7 @@
           <w:rFonts w:ascii="Times New Roman" w:hAnsi="Times New Roman"/>
           <w:sz w:val="22"/>
         </w:rPr>
-        <w:t xml:space="preserve"> estimator combines the data-model probability and the knowledge score using Eq. (1). Each seed uses a stratified 70% training and 30% test split, yielding 900 held-out records per seed and 4,500 paired held-out records overall. A capability perspective is also relevant because model performance depends on complementary organizational resources, not only on the algorithm [6].</w:t>
+        <w:t xml:space="preserve"> estimator combines the data-model probability and the knowledge score using Eq. (1). Each seed uses a stratified 70% training and 30% test split, yielding 900 held-out records per seed and 4,500 paired held-out records overall. A capability perspective is also relevant because model performance depends on complementary organizational resources, not only on the algorithm [7].</w:t>
       </w:r>
     </w:p>
     <w:p>
@@ -762,7 +757,7 @@
           <w:rFonts w:ascii="Times New Roman" w:hAnsi="Times New Roman"/>
           <w:sz w:val="22"/>
         </w:rPr>
-        <w:t>The evaluation reports ROC-AUC, PR-AUC, Brier score, and accuracy. ROC-AUC and PR-AUC evaluate ranking and positive-class retrieval, while the Brier score evaluates probabilistic calibration. These predictive measures are appropriate for a screening system because they separate ranking quality from probability quality [7]. Accuracy is a secondary descriptive measure. Table 1 reports the mean and standard deviation across seeds.</w:t>
+        <w:t>The evaluation reports ROC-AUC, PR-AUC, Brier score, and accuracy. ROC-AUC and PR-AUC evaluate ranking and positive-class retrieval, while the Brier score evaluates probabilistic calibration. These predictive measures are appropriate for a screening system because they separate ranking quality from probability quality [13]. Accuracy is a secondary descriptive measure. Table 1 reports the mean and standard deviation across seeds.</w:t>
       </w:r>
     </w:p>
     <w:p>
@@ -1398,11 +1393,7 @@
         <w:jc w:val="both"/>
       </w:pPr>
       <w:r>
-        <w:rPr>
-          <w:rFonts w:ascii="Times New Roman" w:hAnsi="Times New Roman"/>
-          <w:sz w:val="22"/>
-        </w:rPr>
-        <w:t>Figure 2 provides a visual comparison of ranking, calibration, accuracy, and blend sensitivity. The sensitivity panel shows why the blend parameter should be validated rather than treated as a universal constant. The knowledge layer supplies strong ranking structure in this controlled benchmark, while the data model contributes calibration information that improves the combined probability.</w:t>
+        <w:t>Figure 2 shows pooled receiver-operating-characteristic (ROC) and precision-recall (PR) curves across 4,500 held-out records. The knowledge-rules curve is generally highest, followed closely by hybrid K-AIDE, and both are above data-only AI over much of the operating range. This visual ordering agrees with the mean ROC-AUC and PR-AUC values in Table 1. The blend-sensitivity sweep remains available in the repository as a reproducibility output; α should be selected on validation data rather than treated as universal.</w:t>
       </w:r>
     </w:p>
     <w:p>
@@ -1452,11 +1443,10 @@
       </w:pPr>
       <w:r>
         <w:rPr>
-          <w:rFonts w:ascii="Times New Roman" w:hAnsi="Times New Roman"/>
           <w:i/>
-          <w:sz w:val="20"/>
+          <w:sz w:val="18"/>
         </w:rPr>
-        <w:t>Fig. 2. Repeated-seed performance and blend sensitivity. Bars show mean values with standard-deviation error bars; the lower-right panel varies alpha while holding the held-out records fixed.</w:t>
+        <w:t>Fig. 2. Pooled ROC and precision-recall curves for data-only AI, knowledge rules, and hybrid K-AIDE across 4,500 held-out records from five fixed seeds.</w:t>
       </w:r>
     </w:p>
     <w:p>
@@ -1521,16 +1511,17 @@
       <w:tblPr>
         <w:tblW w:type="auto" w:w="0"/>
         <w:jc w:val="center"/>
-        <w:tblLayout w:type="autofit"/>
+        <w:tblLayout w:type="fixed"/>
         <w:tblLook w:firstColumn="1" w:firstRow="1" w:lastColumn="0" w:lastRow="0" w:noHBand="0" w:noVBand="1" w:val="04A0"/>
       </w:tblPr>
       <w:tblGrid>
-        <w:gridCol w:w="1656"/>
-        <w:gridCol w:w="1656"/>
-        <w:gridCol w:w="1656"/>
-        <w:gridCol w:w="1656"/>
-        <w:gridCol w:w="1656"/>
-        <w:gridCol w:w="1656"/>
+        <w:gridCol w:w="1900"/>
+        <w:gridCol w:w="1050"/>
+        <w:gridCol w:w="1500"/>
+        <w:gridCol w:w="1000"/>
+        <w:gridCol w:w="1000"/>
+        <w:gridCol w:w="1700"/>
+        <w:gridCol w:w="1786"/>
       </w:tblGrid>
       <w:tr>
         <w:trPr>
@@ -1538,7 +1529,7 @@
         </w:trPr>
         <w:tc>
           <w:tcPr>
-            <w:tcW w:type="dxa" w:w="1656"/>
+            <w:tcW w:type="dxa" w:w="1900"/>
             <w:vAlign w:val="center"/>
             <w:shd w:fill="F2F2F2"/>
             <w:tcBorders>
@@ -1547,15 +1538,18 @@
               <w:bottom w:val="single" w:sz="4" w:space="0" w:color="A0A0A0"/>
               <w:right w:val="nil"/>
             </w:tcBorders>
+            <w:tcMar>
+              <w:top w:w="70" w:type="dxa"/>
+              <w:bottom w:w="70" w:type="dxa"/>
+            </w:tcMar>
           </w:tcPr>
           <w:p>
             <w:pPr>
-              <w:spacing w:after="0" w:line="240" w:lineRule="auto"/>
+              <w:jc w:val="left"/>
             </w:pPr>
-            <w:r/>
             <w:r>
               <w:rPr>
-                <w:rFonts w:ascii="Times New Roman" w:hAnsi="Times New Roman"/>
+                <w:rFonts w:ascii="Arial" w:hAnsi="Arial"/>
                 <w:b/>
                 <w:sz w:val="18"/>
               </w:rPr>
@@ -1565,7 +1559,7 @@
         </w:tc>
         <w:tc>
           <w:tcPr>
-            <w:tcW w:type="dxa" w:w="1656"/>
+            <w:tcW w:type="dxa" w:w="1050"/>
             <w:vAlign w:val="center"/>
             <w:shd w:fill="F2F2F2"/>
             <w:tcBorders>
@@ -1574,15 +1568,18 @@
               <w:bottom w:val="single" w:sz="4" w:space="0" w:color="A0A0A0"/>
               <w:right w:val="nil"/>
             </w:tcBorders>
+            <w:tcMar>
+              <w:top w:w="70" w:type="dxa"/>
+              <w:bottom w:w="70" w:type="dxa"/>
+            </w:tcMar>
           </w:tcPr>
           <w:p>
             <w:pPr>
-              <w:spacing w:after="0" w:line="240" w:lineRule="auto"/>
+              <w:jc w:val="center"/>
             </w:pPr>
-            <w:r/>
             <w:r>
               <w:rPr>
-                <w:rFonts w:ascii="Times New Roman" w:hAnsi="Times New Roman"/>
+                <w:rFonts w:ascii="Arial" w:hAnsi="Arial"/>
                 <w:b/>
                 <w:sz w:val="18"/>
               </w:rPr>
@@ -1592,7 +1589,7 @@
         </w:tc>
         <w:tc>
           <w:tcPr>
-            <w:tcW w:type="dxa" w:w="1656"/>
+            <w:tcW w:type="dxa" w:w="1500"/>
             <w:vAlign w:val="center"/>
             <w:shd w:fill="F2F2F2"/>
             <w:tcBorders>
@@ -1601,15 +1598,18 @@
               <w:bottom w:val="single" w:sz="4" w:space="0" w:color="A0A0A0"/>
               <w:right w:val="nil"/>
             </w:tcBorders>
+            <w:tcMar>
+              <w:top w:w="70" w:type="dxa"/>
+              <w:bottom w:w="70" w:type="dxa"/>
+            </w:tcMar>
           </w:tcPr>
           <w:p>
             <w:pPr>
-              <w:spacing w:after="0" w:line="240" w:lineRule="auto"/>
+              <w:jc w:val="center"/>
             </w:pPr>
-            <w:r/>
             <w:r>
               <w:rPr>
-                <w:rFonts w:ascii="Times New Roman" w:hAnsi="Times New Roman"/>
+                <w:rFonts w:ascii="Arial" w:hAnsi="Arial"/>
                 <w:b/>
                 <w:sz w:val="18"/>
               </w:rPr>
@@ -1619,7 +1619,7 @@
         </w:tc>
         <w:tc>
           <w:tcPr>
-            <w:tcW w:type="dxa" w:w="1656"/>
+            <w:tcW w:type="dxa" w:w="1000"/>
             <w:vAlign w:val="center"/>
             <w:shd w:fill="F2F2F2"/>
             <w:tcBorders>
@@ -1628,15 +1628,18 @@
               <w:bottom w:val="single" w:sz="4" w:space="0" w:color="A0A0A0"/>
               <w:right w:val="nil"/>
             </w:tcBorders>
+            <w:tcMar>
+              <w:top w:w="70" w:type="dxa"/>
+              <w:bottom w:w="70" w:type="dxa"/>
+            </w:tcMar>
           </w:tcPr>
           <w:p>
             <w:pPr>
-              <w:spacing w:after="0" w:line="240" w:lineRule="auto"/>
+              <w:jc w:val="center"/>
             </w:pPr>
-            <w:r/>
             <w:r>
               <w:rPr>
-                <w:rFonts w:ascii="Times New Roman" w:hAnsi="Times New Roman"/>
+                <w:rFonts w:ascii="Arial" w:hAnsi="Arial"/>
                 <w:b/>
                 <w:sz w:val="18"/>
               </w:rPr>
@@ -1646,7 +1649,7 @@
         </w:tc>
         <w:tc>
           <w:tcPr>
-            <w:tcW w:type="dxa" w:w="1656"/>
+            <w:tcW w:type="dxa" w:w="1000"/>
             <w:vAlign w:val="center"/>
             <w:shd w:fill="F2F2F2"/>
             <w:tcBorders>
@@ -1655,15 +1658,48 @@
               <w:bottom w:val="single" w:sz="4" w:space="0" w:color="A0A0A0"/>
               <w:right w:val="nil"/>
             </w:tcBorders>
+            <w:tcMar>
+              <w:top w:w="70" w:type="dxa"/>
+              <w:bottom w:w="70" w:type="dxa"/>
+            </w:tcMar>
           </w:tcPr>
           <w:p>
             <w:pPr>
-              <w:spacing w:after="0" w:line="240" w:lineRule="auto"/>
+              <w:jc w:val="center"/>
             </w:pPr>
-            <w:r/>
             <w:r>
               <w:rPr>
-                <w:rFonts w:ascii="Times New Roman" w:hAnsi="Times New Roman"/>
+                <w:rFonts w:ascii="Arial" w:hAnsi="Arial"/>
+                <w:b/>
+                <w:sz w:val="18"/>
+              </w:rPr>
+              <w:t>PR-AUC</w:t>
+            </w:r>
+          </w:p>
+        </w:tc>
+        <w:tc>
+          <w:tcPr>
+            <w:tcW w:type="dxa" w:w="1700"/>
+            <w:vAlign w:val="center"/>
+            <w:shd w:fill="F2F2F2"/>
+            <w:tcBorders>
+              <w:top w:val="nil"/>
+              <w:left w:val="nil"/>
+              <w:bottom w:val="single" w:sz="4" w:space="0" w:color="A0A0A0"/>
+              <w:right w:val="nil"/>
+            </w:tcBorders>
+            <w:tcMar>
+              <w:top w:w="70" w:type="dxa"/>
+              <w:bottom w:w="70" w:type="dxa"/>
+            </w:tcMar>
+          </w:tcPr>
+          <w:p>
+            <w:pPr>
+              <w:jc w:val="center"/>
+            </w:pPr>
+            <w:r>
+              <w:rPr>
+                <w:rFonts w:ascii="Arial" w:hAnsi="Arial"/>
                 <w:b/>
                 <w:sz w:val="18"/>
               </w:rPr>
@@ -1673,7 +1709,7 @@
         </w:tc>
         <w:tc>
           <w:tcPr>
-            <w:tcW w:type="dxa" w:w="1656"/>
+            <w:tcW w:type="dxa" w:w="1786"/>
             <w:vAlign w:val="center"/>
             <w:shd w:fill="F2F2F2"/>
             <w:tcBorders>
@@ -1682,15 +1718,18 @@
               <w:bottom w:val="single" w:sz="4" w:space="0" w:color="A0A0A0"/>
               <w:right w:val="nil"/>
             </w:tcBorders>
+            <w:tcMar>
+              <w:top w:w="70" w:type="dxa"/>
+              <w:bottom w:w="70" w:type="dxa"/>
+            </w:tcMar>
           </w:tcPr>
           <w:p>
             <w:pPr>
-              <w:spacing w:after="0" w:line="240" w:lineRule="auto"/>
+              <w:jc w:val="center"/>
             </w:pPr>
-            <w:r/>
             <w:r>
               <w:rPr>
-                <w:rFonts w:ascii="Times New Roman" w:hAnsi="Times New Roman"/>
+                <w:rFonts w:ascii="Arial" w:hAnsi="Arial"/>
                 <w:b/>
                 <w:sz w:val="18"/>
               </w:rPr>
@@ -1702,7 +1741,7 @@
       <w:tr>
         <w:tc>
           <w:tcPr>
-            <w:tcW w:type="dxa" w:w="1656"/>
+            <w:tcW w:type="dxa" w:w="1900"/>
             <w:vAlign w:val="center"/>
             <w:tcBorders>
               <w:top w:val="nil"/>
@@ -1710,15 +1749,18 @@
               <w:bottom w:val="single" w:sz="4" w:space="0" w:color="A0A0A0"/>
               <w:right w:val="nil"/>
             </w:tcBorders>
+            <w:tcMar>
+              <w:top w:w="70" w:type="dxa"/>
+              <w:bottom w:w="70" w:type="dxa"/>
+            </w:tcMar>
           </w:tcPr>
           <w:p>
             <w:pPr>
-              <w:spacing w:after="0" w:line="240" w:lineRule="auto"/>
+              <w:jc w:val="left"/>
             </w:pPr>
-            <w:r/>
             <w:r>
               <w:rPr>
-                <w:rFonts w:ascii="Times New Roman" w:hAnsi="Times New Roman"/>
+                <w:rFonts w:ascii="Arial" w:hAnsi="Arial"/>
                 <w:b w:val="0"/>
                 <w:sz w:val="18"/>
               </w:rPr>
@@ -1728,7 +1770,7 @@
         </w:tc>
         <w:tc>
           <w:tcPr>
-            <w:tcW w:type="dxa" w:w="1656"/>
+            <w:tcW w:type="dxa" w:w="1050"/>
             <w:vAlign w:val="center"/>
             <w:tcBorders>
               <w:top w:val="nil"/>
@@ -1736,15 +1778,18 @@
               <w:bottom w:val="single" w:sz="4" w:space="0" w:color="A0A0A0"/>
               <w:right w:val="nil"/>
             </w:tcBorders>
+            <w:tcMar>
+              <w:top w:w="70" w:type="dxa"/>
+              <w:bottom w:w="70" w:type="dxa"/>
+            </w:tcMar>
           </w:tcPr>
           <w:p>
             <w:pPr>
-              <w:spacing w:after="0" w:line="240" w:lineRule="auto"/>
+              <w:jc w:val="center"/>
             </w:pPr>
-            <w:r/>
             <w:r>
               <w:rPr>
-                <w:rFonts w:ascii="Times New Roman" w:hAnsi="Times New Roman"/>
+                <w:rFonts w:ascii="Arial" w:hAnsi="Arial"/>
                 <w:b w:val="0"/>
                 <w:sz w:val="18"/>
               </w:rPr>
@@ -1754,7 +1799,7 @@
         </w:tc>
         <w:tc>
           <w:tcPr>
-            <w:tcW w:type="dxa" w:w="1656"/>
+            <w:tcW w:type="dxa" w:w="1500"/>
             <w:vAlign w:val="center"/>
             <w:tcBorders>
               <w:top w:val="nil"/>
@@ -1762,15 +1807,18 @@
               <w:bottom w:val="single" w:sz="4" w:space="0" w:color="A0A0A0"/>
               <w:right w:val="nil"/>
             </w:tcBorders>
+            <w:tcMar>
+              <w:top w:w="70" w:type="dxa"/>
+              <w:bottom w:w="70" w:type="dxa"/>
+            </w:tcMar>
           </w:tcPr>
           <w:p>
             <w:pPr>
-              <w:spacing w:after="0" w:line="240" w:lineRule="auto"/>
+              <w:jc w:val="center"/>
             </w:pPr>
-            <w:r/>
             <w:r>
               <w:rPr>
-                <w:rFonts w:ascii="Times New Roman" w:hAnsi="Times New Roman"/>
+                <w:rFonts w:ascii="Arial" w:hAnsi="Arial"/>
                 <w:b w:val="0"/>
                 <w:sz w:val="18"/>
               </w:rPr>
@@ -1780,7 +1828,7 @@
         </w:tc>
         <w:tc>
           <w:tcPr>
-            <w:tcW w:type="dxa" w:w="1656"/>
+            <w:tcW w:type="dxa" w:w="1000"/>
             <w:vAlign w:val="center"/>
             <w:tcBorders>
               <w:top w:val="nil"/>
@@ -1788,15 +1836,18 @@
               <w:bottom w:val="single" w:sz="4" w:space="0" w:color="A0A0A0"/>
               <w:right w:val="nil"/>
             </w:tcBorders>
+            <w:tcMar>
+              <w:top w:w="70" w:type="dxa"/>
+              <w:bottom w:w="70" w:type="dxa"/>
+            </w:tcMar>
           </w:tcPr>
           <w:p>
             <w:pPr>
-              <w:spacing w:after="0" w:line="240" w:lineRule="auto"/>
+              <w:jc w:val="center"/>
             </w:pPr>
-            <w:r/>
             <w:r>
               <w:rPr>
-                <w:rFonts w:ascii="Times New Roman" w:hAnsi="Times New Roman"/>
+                <w:rFonts w:ascii="Arial" w:hAnsi="Arial"/>
                 <w:b w:val="0"/>
                 <w:sz w:val="18"/>
               </w:rPr>
@@ -1806,7 +1857,7 @@
         </w:tc>
         <w:tc>
           <w:tcPr>
-            <w:tcW w:type="dxa" w:w="1656"/>
+            <w:tcW w:type="dxa" w:w="1000"/>
             <w:vAlign w:val="center"/>
             <w:tcBorders>
               <w:top w:val="nil"/>
@@ -1814,15 +1865,47 @@
               <w:bottom w:val="single" w:sz="4" w:space="0" w:color="A0A0A0"/>
               <w:right w:val="nil"/>
             </w:tcBorders>
+            <w:tcMar>
+              <w:top w:w="70" w:type="dxa"/>
+              <w:bottom w:w="70" w:type="dxa"/>
+            </w:tcMar>
           </w:tcPr>
           <w:p>
             <w:pPr>
-              <w:spacing w:after="0" w:line="240" w:lineRule="auto"/>
+              <w:jc w:val="center"/>
             </w:pPr>
-            <w:r/>
             <w:r>
               <w:rPr>
-                <w:rFonts w:ascii="Times New Roman" w:hAnsi="Times New Roman"/>
+                <w:rFonts w:ascii="Arial" w:hAnsi="Arial"/>
+                <w:b w:val="0"/>
+                <w:sz w:val="18"/>
+              </w:rPr>
+              <w:t>0.4804</w:t>
+            </w:r>
+          </w:p>
+        </w:tc>
+        <w:tc>
+          <w:tcPr>
+            <w:tcW w:type="dxa" w:w="1700"/>
+            <w:vAlign w:val="center"/>
+            <w:tcBorders>
+              <w:top w:val="nil"/>
+              <w:left w:val="nil"/>
+              <w:bottom w:val="single" w:sz="4" w:space="0" w:color="A0A0A0"/>
+              <w:right w:val="nil"/>
+            </w:tcBorders>
+            <w:tcMar>
+              <w:top w:w="70" w:type="dxa"/>
+              <w:bottom w:w="70" w:type="dxa"/>
+            </w:tcMar>
+          </w:tcPr>
+          <w:p>
+            <w:pPr>
+              <w:jc w:val="center"/>
+            </w:pPr>
+            <w:r>
+              <w:rPr>
+                <w:rFonts w:ascii="Arial" w:hAnsi="Arial"/>
                 <w:b w:val="0"/>
                 <w:sz w:val="18"/>
               </w:rPr>
@@ -1832,7 +1915,7 @@
         </w:tc>
         <w:tc>
           <w:tcPr>
-            <w:tcW w:type="dxa" w:w="1656"/>
+            <w:tcW w:type="dxa" w:w="1786"/>
             <w:vAlign w:val="center"/>
             <w:tcBorders>
               <w:top w:val="nil"/>
@@ -1840,15 +1923,18 @@
               <w:bottom w:val="single" w:sz="4" w:space="0" w:color="A0A0A0"/>
               <w:right w:val="nil"/>
             </w:tcBorders>
+            <w:tcMar>
+              <w:top w:w="70" w:type="dxa"/>
+              <w:bottom w:w="70" w:type="dxa"/>
+            </w:tcMar>
           </w:tcPr>
           <w:p>
             <w:pPr>
-              <w:spacing w:after="0" w:line="240" w:lineRule="auto"/>
+              <w:jc w:val="center"/>
             </w:pPr>
-            <w:r/>
             <w:r>
               <w:rPr>
-                <w:rFonts w:ascii="Times New Roman" w:hAnsi="Times New Roman"/>
+                <w:rFonts w:ascii="Arial" w:hAnsi="Arial"/>
                 <w:b w:val="0"/>
                 <w:sz w:val="18"/>
               </w:rPr>
@@ -1860,7 +1946,7 @@
       <w:tr>
         <w:tc>
           <w:tcPr>
-            <w:tcW w:type="dxa" w:w="1656"/>
+            <w:tcW w:type="dxa" w:w="1900"/>
             <w:vAlign w:val="center"/>
             <w:tcBorders>
               <w:top w:val="nil"/>
@@ -1868,15 +1954,18 @@
               <w:bottom w:val="single" w:sz="4" w:space="0" w:color="A0A0A0"/>
               <w:right w:val="nil"/>
             </w:tcBorders>
+            <w:tcMar>
+              <w:top w:w="70" w:type="dxa"/>
+              <w:bottom w:w="70" w:type="dxa"/>
+            </w:tcMar>
           </w:tcPr>
           <w:p>
             <w:pPr>
-              <w:spacing w:after="0" w:line="240" w:lineRule="auto"/>
+              <w:jc w:val="left"/>
             </w:pPr>
-            <w:r/>
             <w:r>
               <w:rPr>
-                <w:rFonts w:ascii="Times New Roman" w:hAnsi="Times New Roman"/>
+                <w:rFonts w:ascii="Arial" w:hAnsi="Arial"/>
                 <w:b w:val="0"/>
                 <w:sz w:val="18"/>
               </w:rPr>
@@ -1886,7 +1975,7 @@
         </w:tc>
         <w:tc>
           <w:tcPr>
-            <w:tcW w:type="dxa" w:w="1656"/>
+            <w:tcW w:type="dxa" w:w="1050"/>
             <w:vAlign w:val="center"/>
             <w:tcBorders>
               <w:top w:val="nil"/>
@@ -1894,15 +1983,18 @@
               <w:bottom w:val="single" w:sz="4" w:space="0" w:color="A0A0A0"/>
               <w:right w:val="nil"/>
             </w:tcBorders>
+            <w:tcMar>
+              <w:top w:w="70" w:type="dxa"/>
+              <w:bottom w:w="70" w:type="dxa"/>
+            </w:tcMar>
           </w:tcPr>
           <w:p>
             <w:pPr>
-              <w:spacing w:after="0" w:line="240" w:lineRule="auto"/>
+              <w:jc w:val="center"/>
             </w:pPr>
-            <w:r/>
             <w:r>
               <w:rPr>
-                <w:rFonts w:ascii="Times New Roman" w:hAnsi="Times New Roman"/>
+                <w:rFonts w:ascii="Arial" w:hAnsi="Arial"/>
                 <w:b w:val="0"/>
                 <w:sz w:val="18"/>
               </w:rPr>
@@ -1912,7 +2004,7 @@
         </w:tc>
         <w:tc>
           <w:tcPr>
-            <w:tcW w:type="dxa" w:w="1656"/>
+            <w:tcW w:type="dxa" w:w="1500"/>
             <w:vAlign w:val="center"/>
             <w:tcBorders>
               <w:top w:val="nil"/>
@@ -1920,15 +2012,18 @@
               <w:bottom w:val="single" w:sz="4" w:space="0" w:color="A0A0A0"/>
               <w:right w:val="nil"/>
             </w:tcBorders>
+            <w:tcMar>
+              <w:top w:w="70" w:type="dxa"/>
+              <w:bottom w:w="70" w:type="dxa"/>
+            </w:tcMar>
           </w:tcPr>
           <w:p>
             <w:pPr>
-              <w:spacing w:after="0" w:line="240" w:lineRule="auto"/>
+              <w:jc w:val="center"/>
             </w:pPr>
-            <w:r/>
             <w:r>
               <w:rPr>
-                <w:rFonts w:ascii="Times New Roman" w:hAnsi="Times New Roman"/>
+                <w:rFonts w:ascii="Arial" w:hAnsi="Arial"/>
                 <w:b w:val="0"/>
                 <w:sz w:val="18"/>
               </w:rPr>
@@ -1938,7 +2033,7 @@
         </w:tc>
         <w:tc>
           <w:tcPr>
-            <w:tcW w:type="dxa" w:w="1656"/>
+            <w:tcW w:type="dxa" w:w="1000"/>
             <w:vAlign w:val="center"/>
             <w:tcBorders>
               <w:top w:val="nil"/>
@@ -1946,15 +2041,18 @@
               <w:bottom w:val="single" w:sz="4" w:space="0" w:color="A0A0A0"/>
               <w:right w:val="nil"/>
             </w:tcBorders>
+            <w:tcMar>
+              <w:top w:w="70" w:type="dxa"/>
+              <w:bottom w:w="70" w:type="dxa"/>
+            </w:tcMar>
           </w:tcPr>
           <w:p>
             <w:pPr>
-              <w:spacing w:after="0" w:line="240" w:lineRule="auto"/>
+              <w:jc w:val="center"/>
             </w:pPr>
-            <w:r/>
             <w:r>
               <w:rPr>
-                <w:rFonts w:ascii="Times New Roman" w:hAnsi="Times New Roman"/>
+                <w:rFonts w:ascii="Arial" w:hAnsi="Arial"/>
                 <w:b w:val="0"/>
                 <w:sz w:val="18"/>
               </w:rPr>
@@ -1964,7 +2062,7 @@
         </w:tc>
         <w:tc>
           <w:tcPr>
-            <w:tcW w:type="dxa" w:w="1656"/>
+            <w:tcW w:type="dxa" w:w="1000"/>
             <w:vAlign w:val="center"/>
             <w:tcBorders>
               <w:top w:val="nil"/>
@@ -1972,15 +2070,47 @@
               <w:bottom w:val="single" w:sz="4" w:space="0" w:color="A0A0A0"/>
               <w:right w:val="nil"/>
             </w:tcBorders>
+            <w:tcMar>
+              <w:top w:w="70" w:type="dxa"/>
+              <w:bottom w:w="70" w:type="dxa"/>
+            </w:tcMar>
           </w:tcPr>
           <w:p>
             <w:pPr>
-              <w:spacing w:after="0" w:line="240" w:lineRule="auto"/>
+              <w:jc w:val="center"/>
             </w:pPr>
-            <w:r/>
             <w:r>
               <w:rPr>
-                <w:rFonts w:ascii="Times New Roman" w:hAnsi="Times New Roman"/>
+                <w:rFonts w:ascii="Arial" w:hAnsi="Arial"/>
+                <w:b w:val="0"/>
+                <w:sz w:val="18"/>
+              </w:rPr>
+              <w:t>0.7119</w:t>
+            </w:r>
+          </w:p>
+        </w:tc>
+        <w:tc>
+          <w:tcPr>
+            <w:tcW w:type="dxa" w:w="1700"/>
+            <w:vAlign w:val="center"/>
+            <w:tcBorders>
+              <w:top w:val="nil"/>
+              <w:left w:val="nil"/>
+              <w:bottom w:val="single" w:sz="4" w:space="0" w:color="A0A0A0"/>
+              <w:right w:val="nil"/>
+            </w:tcBorders>
+            <w:tcMar>
+              <w:top w:w="70" w:type="dxa"/>
+              <w:bottom w:w="70" w:type="dxa"/>
+            </w:tcMar>
+          </w:tcPr>
+          <w:p>
+            <w:pPr>
+              <w:jc w:val="center"/>
+            </w:pPr>
+            <w:r>
+              <w:rPr>
+                <w:rFonts w:ascii="Arial" w:hAnsi="Arial"/>
                 <w:b w:val="0"/>
                 <w:sz w:val="18"/>
               </w:rPr>
@@ -1990,7 +2120,7 @@
         </w:tc>
         <w:tc>
           <w:tcPr>
-            <w:tcW w:type="dxa" w:w="1656"/>
+            <w:tcW w:type="dxa" w:w="1786"/>
             <w:vAlign w:val="center"/>
             <w:tcBorders>
               <w:top w:val="nil"/>
@@ -1998,15 +2128,18 @@
               <w:bottom w:val="single" w:sz="4" w:space="0" w:color="A0A0A0"/>
               <w:right w:val="nil"/>
             </w:tcBorders>
+            <w:tcMar>
+              <w:top w:w="70" w:type="dxa"/>
+              <w:bottom w:w="70" w:type="dxa"/>
+            </w:tcMar>
           </w:tcPr>
           <w:p>
             <w:pPr>
-              <w:spacing w:after="0" w:line="240" w:lineRule="auto"/>
+              <w:jc w:val="center"/>
             </w:pPr>
-            <w:r/>
             <w:r>
               <w:rPr>
-                <w:rFonts w:ascii="Times New Roman" w:hAnsi="Times New Roman"/>
+                <w:rFonts w:ascii="Arial" w:hAnsi="Arial"/>
                 <w:b w:val="0"/>
                 <w:sz w:val="18"/>
               </w:rPr>
@@ -2018,7 +2151,7 @@
       <w:tr>
         <w:tc>
           <w:tcPr>
-            <w:tcW w:type="dxa" w:w="1656"/>
+            <w:tcW w:type="dxa" w:w="1900"/>
             <w:vAlign w:val="center"/>
             <w:tcBorders>
               <w:top w:val="nil"/>
@@ -2026,15 +2159,18 @@
               <w:bottom w:val="single" w:sz="4" w:space="0" w:color="A0A0A0"/>
               <w:right w:val="nil"/>
             </w:tcBorders>
+            <w:tcMar>
+              <w:top w:w="70" w:type="dxa"/>
+              <w:bottom w:w="70" w:type="dxa"/>
+            </w:tcMar>
           </w:tcPr>
           <w:p>
             <w:pPr>
-              <w:spacing w:after="0" w:line="240" w:lineRule="auto"/>
+              <w:jc w:val="left"/>
             </w:pPr>
-            <w:r/>
             <w:r>
               <w:rPr>
-                <w:rFonts w:ascii="Times New Roman" w:hAnsi="Times New Roman"/>
+                <w:rFonts w:ascii="Arial" w:hAnsi="Arial"/>
                 <w:b w:val="0"/>
                 <w:sz w:val="18"/>
               </w:rPr>
@@ -2044,7 +2180,7 @@
         </w:tc>
         <w:tc>
           <w:tcPr>
-            <w:tcW w:type="dxa" w:w="1656"/>
+            <w:tcW w:type="dxa" w:w="1050"/>
             <w:vAlign w:val="center"/>
             <w:tcBorders>
               <w:top w:val="nil"/>
@@ -2052,15 +2188,18 @@
               <w:bottom w:val="single" w:sz="4" w:space="0" w:color="A0A0A0"/>
               <w:right w:val="nil"/>
             </w:tcBorders>
+            <w:tcMar>
+              <w:top w:w="70" w:type="dxa"/>
+              <w:bottom w:w="70" w:type="dxa"/>
+            </w:tcMar>
           </w:tcPr>
           <w:p>
             <w:pPr>
-              <w:spacing w:after="0" w:line="240" w:lineRule="auto"/>
+              <w:jc w:val="center"/>
             </w:pPr>
-            <w:r/>
             <w:r>
               <w:rPr>
-                <w:rFonts w:ascii="Times New Roman" w:hAnsi="Times New Roman"/>
+                <w:rFonts w:ascii="Arial" w:hAnsi="Arial"/>
                 <w:b w:val="0"/>
                 <w:sz w:val="18"/>
               </w:rPr>
@@ -2070,7 +2209,7 @@
         </w:tc>
         <w:tc>
           <w:tcPr>
-            <w:tcW w:type="dxa" w:w="1656"/>
+            <w:tcW w:type="dxa" w:w="1500"/>
             <w:vAlign w:val="center"/>
             <w:tcBorders>
               <w:top w:val="nil"/>
@@ -2078,15 +2217,18 @@
               <w:bottom w:val="single" w:sz="4" w:space="0" w:color="A0A0A0"/>
               <w:right w:val="nil"/>
             </w:tcBorders>
+            <w:tcMar>
+              <w:top w:w="70" w:type="dxa"/>
+              <w:bottom w:w="70" w:type="dxa"/>
+            </w:tcMar>
           </w:tcPr>
           <w:p>
             <w:pPr>
-              <w:spacing w:after="0" w:line="240" w:lineRule="auto"/>
+              <w:jc w:val="center"/>
             </w:pPr>
-            <w:r/>
             <w:r>
               <w:rPr>
-                <w:rFonts w:ascii="Times New Roman" w:hAnsi="Times New Roman"/>
+                <w:rFonts w:ascii="Arial" w:hAnsi="Arial"/>
                 <w:b w:val="0"/>
                 <w:sz w:val="18"/>
               </w:rPr>
@@ -2096,7 +2238,7 @@
         </w:tc>
         <w:tc>
           <w:tcPr>
-            <w:tcW w:type="dxa" w:w="1656"/>
+            <w:tcW w:type="dxa" w:w="1000"/>
             <w:vAlign w:val="center"/>
             <w:tcBorders>
               <w:top w:val="nil"/>
@@ -2104,15 +2246,18 @@
               <w:bottom w:val="single" w:sz="4" w:space="0" w:color="A0A0A0"/>
               <w:right w:val="nil"/>
             </w:tcBorders>
+            <w:tcMar>
+              <w:top w:w="70" w:type="dxa"/>
+              <w:bottom w:w="70" w:type="dxa"/>
+            </w:tcMar>
           </w:tcPr>
           <w:p>
             <w:pPr>
-              <w:spacing w:after="0" w:line="240" w:lineRule="auto"/>
+              <w:jc w:val="center"/>
             </w:pPr>
-            <w:r/>
             <w:r>
               <w:rPr>
-                <w:rFonts w:ascii="Times New Roman" w:hAnsi="Times New Roman"/>
+                <w:rFonts w:ascii="Arial" w:hAnsi="Arial"/>
                 <w:b w:val="0"/>
                 <w:sz w:val="18"/>
               </w:rPr>
@@ -2122,7 +2267,7 @@
         </w:tc>
         <w:tc>
           <w:tcPr>
-            <w:tcW w:type="dxa" w:w="1656"/>
+            <w:tcW w:type="dxa" w:w="1000"/>
             <w:vAlign w:val="center"/>
             <w:tcBorders>
               <w:top w:val="nil"/>
@@ -2130,15 +2275,47 @@
               <w:bottom w:val="single" w:sz="4" w:space="0" w:color="A0A0A0"/>
               <w:right w:val="nil"/>
             </w:tcBorders>
+            <w:tcMar>
+              <w:top w:w="70" w:type="dxa"/>
+              <w:bottom w:w="70" w:type="dxa"/>
+            </w:tcMar>
           </w:tcPr>
           <w:p>
             <w:pPr>
-              <w:spacing w:after="0" w:line="240" w:lineRule="auto"/>
+              <w:jc w:val="center"/>
             </w:pPr>
-            <w:r/>
             <w:r>
               <w:rPr>
-                <w:rFonts w:ascii="Times New Roman" w:hAnsi="Times New Roman"/>
+                <w:rFonts w:ascii="Arial" w:hAnsi="Arial"/>
+                <w:b w:val="0"/>
+                <w:sz w:val="18"/>
+              </w:rPr>
+              <w:t>0.7373</w:t>
+            </w:r>
+          </w:p>
+        </w:tc>
+        <w:tc>
+          <w:tcPr>
+            <w:tcW w:type="dxa" w:w="1700"/>
+            <w:vAlign w:val="center"/>
+            <w:tcBorders>
+              <w:top w:val="nil"/>
+              <w:left w:val="nil"/>
+              <w:bottom w:val="single" w:sz="4" w:space="0" w:color="A0A0A0"/>
+              <w:right w:val="nil"/>
+            </w:tcBorders>
+            <w:tcMar>
+              <w:top w:w="70" w:type="dxa"/>
+              <w:bottom w:w="70" w:type="dxa"/>
+            </w:tcMar>
+          </w:tcPr>
+          <w:p>
+            <w:pPr>
+              <w:jc w:val="center"/>
+            </w:pPr>
+            <w:r>
+              <w:rPr>
+                <w:rFonts w:ascii="Arial" w:hAnsi="Arial"/>
                 <w:b w:val="0"/>
                 <w:sz w:val="18"/>
               </w:rPr>
@@ -2148,7 +2325,7 @@
         </w:tc>
         <w:tc>
           <w:tcPr>
-            <w:tcW w:type="dxa" w:w="1656"/>
+            <w:tcW w:type="dxa" w:w="1786"/>
             <w:vAlign w:val="center"/>
             <w:tcBorders>
               <w:top w:val="nil"/>
@@ -2156,15 +2333,18 @@
               <w:bottom w:val="single" w:sz="4" w:space="0" w:color="A0A0A0"/>
               <w:right w:val="nil"/>
             </w:tcBorders>
+            <w:tcMar>
+              <w:top w:w="70" w:type="dxa"/>
+              <w:bottom w:w="70" w:type="dxa"/>
+            </w:tcMar>
           </w:tcPr>
           <w:p>
             <w:pPr>
-              <w:spacing w:after="0" w:line="240" w:lineRule="auto"/>
+              <w:jc w:val="center"/>
             </w:pPr>
-            <w:r/>
             <w:r>
               <w:rPr>
-                <w:rFonts w:ascii="Times New Roman" w:hAnsi="Times New Roman"/>
+                <w:rFonts w:ascii="Arial" w:hAnsi="Arial"/>
                 <w:b w:val="0"/>
                 <w:sz w:val="18"/>
               </w:rPr>
@@ -2176,7 +2356,7 @@
       <w:tr>
         <w:tc>
           <w:tcPr>
-            <w:tcW w:type="dxa" w:w="1656"/>
+            <w:tcW w:type="dxa" w:w="1900"/>
             <w:vAlign w:val="center"/>
             <w:tcBorders>
               <w:top w:val="nil"/>
@@ -2184,15 +2364,18 @@
               <w:bottom w:val="single" w:sz="4" w:space="0" w:color="A0A0A0"/>
               <w:right w:val="nil"/>
             </w:tcBorders>
+            <w:tcMar>
+              <w:top w:w="70" w:type="dxa"/>
+              <w:bottom w:w="70" w:type="dxa"/>
+            </w:tcMar>
           </w:tcPr>
           <w:p>
             <w:pPr>
-              <w:spacing w:after="0" w:line="240" w:lineRule="auto"/>
+              <w:jc w:val="left"/>
             </w:pPr>
-            <w:r/>
             <w:r>
               <w:rPr>
-                <w:rFonts w:ascii="Times New Roman" w:hAnsi="Times New Roman"/>
+                <w:rFonts w:ascii="Arial" w:hAnsi="Arial"/>
                 <w:b w:val="0"/>
                 <w:sz w:val="18"/>
               </w:rPr>
@@ -2202,7 +2385,7 @@
         </w:tc>
         <w:tc>
           <w:tcPr>
-            <w:tcW w:type="dxa" w:w="1656"/>
+            <w:tcW w:type="dxa" w:w="1050"/>
             <w:vAlign w:val="center"/>
             <w:tcBorders>
               <w:top w:val="nil"/>
@@ -2210,15 +2393,18 @@
               <w:bottom w:val="single" w:sz="4" w:space="0" w:color="A0A0A0"/>
               <w:right w:val="nil"/>
             </w:tcBorders>
+            <w:tcMar>
+              <w:top w:w="70" w:type="dxa"/>
+              <w:bottom w:w="70" w:type="dxa"/>
+            </w:tcMar>
           </w:tcPr>
           <w:p>
             <w:pPr>
-              <w:spacing w:after="0" w:line="240" w:lineRule="auto"/>
+              <w:jc w:val="center"/>
             </w:pPr>
-            <w:r/>
             <w:r>
               <w:rPr>
-                <w:rFonts w:ascii="Times New Roman" w:hAnsi="Times New Roman"/>
+                <w:rFonts w:ascii="Arial" w:hAnsi="Arial"/>
                 <w:b w:val="0"/>
                 <w:sz w:val="18"/>
               </w:rPr>
@@ -2228,7 +2414,7 @@
         </w:tc>
         <w:tc>
           <w:tcPr>
-            <w:tcW w:type="dxa" w:w="1656"/>
+            <w:tcW w:type="dxa" w:w="1500"/>
             <w:vAlign w:val="center"/>
             <w:tcBorders>
               <w:top w:val="nil"/>
@@ -2236,15 +2422,18 @@
               <w:bottom w:val="single" w:sz="4" w:space="0" w:color="A0A0A0"/>
               <w:right w:val="nil"/>
             </w:tcBorders>
+            <w:tcMar>
+              <w:top w:w="70" w:type="dxa"/>
+              <w:bottom w:w="70" w:type="dxa"/>
+            </w:tcMar>
           </w:tcPr>
           <w:p>
             <w:pPr>
-              <w:spacing w:after="0" w:line="240" w:lineRule="auto"/>
+              <w:jc w:val="center"/>
             </w:pPr>
-            <w:r/>
             <w:r>
               <w:rPr>
-                <w:rFonts w:ascii="Times New Roman" w:hAnsi="Times New Roman"/>
+                <w:rFonts w:ascii="Arial" w:hAnsi="Arial"/>
                 <w:b w:val="0"/>
                 <w:sz w:val="18"/>
               </w:rPr>
@@ -2254,7 +2443,7 @@
         </w:tc>
         <w:tc>
           <w:tcPr>
-            <w:tcW w:type="dxa" w:w="1656"/>
+            <w:tcW w:type="dxa" w:w="1000"/>
             <w:vAlign w:val="center"/>
             <w:tcBorders>
               <w:top w:val="nil"/>
@@ -2262,15 +2451,18 @@
               <w:bottom w:val="single" w:sz="4" w:space="0" w:color="A0A0A0"/>
               <w:right w:val="nil"/>
             </w:tcBorders>
+            <w:tcMar>
+              <w:top w:w="70" w:type="dxa"/>
+              <w:bottom w:w="70" w:type="dxa"/>
+            </w:tcMar>
           </w:tcPr>
           <w:p>
             <w:pPr>
-              <w:spacing w:after="0" w:line="240" w:lineRule="auto"/>
+              <w:jc w:val="center"/>
             </w:pPr>
-            <w:r/>
             <w:r>
               <w:rPr>
-                <w:rFonts w:ascii="Times New Roman" w:hAnsi="Times New Roman"/>
+                <w:rFonts w:ascii="Arial" w:hAnsi="Arial"/>
                 <w:b w:val="0"/>
                 <w:sz w:val="18"/>
               </w:rPr>
@@ -2280,7 +2472,7 @@
         </w:tc>
         <w:tc>
           <w:tcPr>
-            <w:tcW w:type="dxa" w:w="1656"/>
+            <w:tcW w:type="dxa" w:w="1000"/>
             <w:vAlign w:val="center"/>
             <w:tcBorders>
               <w:top w:val="nil"/>
@@ -2288,15 +2480,47 @@
               <w:bottom w:val="single" w:sz="4" w:space="0" w:color="A0A0A0"/>
               <w:right w:val="nil"/>
             </w:tcBorders>
+            <w:tcMar>
+              <w:top w:w="70" w:type="dxa"/>
+              <w:bottom w:w="70" w:type="dxa"/>
+            </w:tcMar>
           </w:tcPr>
           <w:p>
             <w:pPr>
-              <w:spacing w:after="0" w:line="240" w:lineRule="auto"/>
+              <w:jc w:val="center"/>
             </w:pPr>
-            <w:r/>
             <w:r>
               <w:rPr>
-                <w:rFonts w:ascii="Times New Roman" w:hAnsi="Times New Roman"/>
+                <w:rFonts w:ascii="Arial" w:hAnsi="Arial"/>
+                <w:b w:val="0"/>
+                <w:sz w:val="18"/>
+              </w:rPr>
+              <w:t>0.7266</w:t>
+            </w:r>
+          </w:p>
+        </w:tc>
+        <w:tc>
+          <w:tcPr>
+            <w:tcW w:type="dxa" w:w="1700"/>
+            <w:vAlign w:val="center"/>
+            <w:tcBorders>
+              <w:top w:val="nil"/>
+              <w:left w:val="nil"/>
+              <w:bottom w:val="single" w:sz="4" w:space="0" w:color="A0A0A0"/>
+              <w:right w:val="nil"/>
+            </w:tcBorders>
+            <w:tcMar>
+              <w:top w:w="70" w:type="dxa"/>
+              <w:bottom w:w="70" w:type="dxa"/>
+            </w:tcMar>
+          </w:tcPr>
+          <w:p>
+            <w:pPr>
+              <w:jc w:val="center"/>
+            </w:pPr>
+            <w:r>
+              <w:rPr>
+                <w:rFonts w:ascii="Arial" w:hAnsi="Arial"/>
                 <w:b w:val="0"/>
                 <w:sz w:val="18"/>
               </w:rPr>
@@ -2306,7 +2530,7 @@
         </w:tc>
         <w:tc>
           <w:tcPr>
-            <w:tcW w:type="dxa" w:w="1656"/>
+            <w:tcW w:type="dxa" w:w="1786"/>
             <w:vAlign w:val="center"/>
             <w:tcBorders>
               <w:top w:val="nil"/>
@@ -2314,15 +2538,18 @@
               <w:bottom w:val="single" w:sz="4" w:space="0" w:color="A0A0A0"/>
               <w:right w:val="nil"/>
             </w:tcBorders>
+            <w:tcMar>
+              <w:top w:w="70" w:type="dxa"/>
+              <w:bottom w:w="70" w:type="dxa"/>
+            </w:tcMar>
           </w:tcPr>
           <w:p>
             <w:pPr>
-              <w:spacing w:after="0" w:line="240" w:lineRule="auto"/>
+              <w:jc w:val="center"/>
             </w:pPr>
-            <w:r/>
             <w:r>
               <w:rPr>
-                <w:rFonts w:ascii="Times New Roman" w:hAnsi="Times New Roman"/>
+                <w:rFonts w:ascii="Arial" w:hAnsi="Arial"/>
                 <w:b w:val="0"/>
                 <w:sz w:val="18"/>
               </w:rPr>
@@ -2344,11 +2571,7 @@
         <w:jc w:val="both"/>
       </w:pPr>
       <w:r>
-        <w:rPr>
-          <w:rFonts w:ascii="Times New Roman" w:hAnsi="Times New Roman"/>
-          <w:sz w:val="22"/>
-        </w:rPr>
-        <w:t>Values are means across five fixed seeds. The paired tests use record-level squared errors from the same held-out records.</w:t>
+        <w:t>Values are means across five fixed seeds. Paired two-sided Wilcoxon tests on record-level squared errors from the same held-out records give p = 3.147e-05 for hybrid versus data-only and p = 1.995e-20 for hybrid versus knowledge rules. These p-values are descriptive within the generated benchmark and do not support population-level inference.</w:t>
       </w:r>
     </w:p>
     <w:p>
@@ -2356,7 +2579,7 @@
         <w:pStyle w:val="Normal"/>
       </w:pPr>
       <w:r>
-        <w:t>The code package also regenerates five supplementary diagnostic figures not reproduced in this Short Communication for length: a feature correlation heatmap, random-forest feature importance, pooled ROC and precision-recall curves, pooled confusion matrices at the 0.5 threshold, and a calibration (reliability) curve for all three estimators. These are available as optional diagnostic supplements and are not part of the two-figure main manuscript.</w:t>
+        <w:t>The alpha-sensitivity sweep and optional diagnostic outputs are retained in the reproducibility package for auditability; they are not part of the two-figure main manuscript.</w:t>
       </w:r>
     </w:p>
     <w:p>
@@ -2384,7 +2607,7 @@
           <w:rFonts w:ascii="Times New Roman" w:hAnsi="Times New Roman"/>
           <w:sz w:val="22"/>
         </w:rPr>
-        <w:t>The main implication is methodological. Digital transformation and entrepreneurial innovation decisions are not purely predictive tasks. They combine measurable signals with organizational knowledge about resources, risk, compliance, and feasibility. A data-only model may learn useful associations, but it cannot guarantee that a decision respects an explicit constraint unless that constraint is represented in the system. K-AIDE makes the two sources visible and allows them to be evaluated separately.</w:t>
+        <w:t>The main implication is methodological. Digital transformation and entrepreneurial innovation decisions are not purely predictive tasks. They combine measurable signals with organizational knowledge about resources, risk, compliance, and feasibility [1,5,9,10]. A data-only model may learn useful associations, but it cannot guarantee that a decision respects an explicit constraint unless that constraint is represented in the system. K-AIDE makes the two sources visible and allows them to be evaluated separately.</w:t>
       </w:r>
     </w:p>
     <w:p>
@@ -2398,7 +2621,7 @@
           <w:rFonts w:ascii="Times New Roman" w:hAnsi="Times New Roman"/>
           <w:sz w:val="22"/>
         </w:rPr>
-        <w:t>The framework also has a practical implication for innovation governance. A manager can inspect whether an opportunity received a high score because of market and customer signals, because the organization is ready to implement it, or because an interaction rule was activated. This explanation supports a more productive discussion between technical teams, entrepreneurs, and decision-makers. It also creates a record of why a decision-support system recommended or blocked an opportunity. The design follows the principle that interpretable models should be preferred when decision consequences are material [8].</w:t>
+        <w:t>The framework also has a practical implication for innovation governance. A manager can inspect whether an opportunity received a high score because of market and customer signals, because the organization is ready to implement it, or because an interaction rule was activated. This explanation supports a more productive discussion between technical teams, entrepreneurs, and decision-makers. It also creates a record of why a decision-support system recommended or blocked an opportunity. The design follows the principle that interpretable models should be preferred when decision consequences are material [8,10,11].</w:t>
       </w:r>
     </w:p>
     <w:p>
@@ -2412,7 +2635,7 @@
           <w:rFonts w:ascii="Times New Roman" w:hAnsi="Times New Roman"/>
           <w:sz w:val="22"/>
         </w:rPr>
-        <w:t>For researchers, the framework creates several testable extensions. A future study could replace the synthetic benchmark with longitudinal venture or innovation-portfolio data, compare different knowledge representations, and estimate how knowledge revisions affect model drift. Another study could compare rule-based explanations with model-agnostic explanations such as local feature attribution [4]. A further extension could use a knowledge graph to represent relationships among technologies, capabilities, markets, and regulatory requirements, then evaluate graph-based retrieval against a flat rules table.</w:t>
+        <w:t>For researchers, the framework creates several testable extensions. A future study could replace the synthetic benchmark with longitudinal venture or innovation-portfolio data, compare different knowledge representations, and estimate how knowledge revisions affect model drift. Another study could compare rule-based explanations with model-agnostic explanations such as local feature attribution [8,10]. A further extension could use a knowledge graph to represent relationships among technologies, capabilities, markets, and regulatory requirements, then evaluate graph-based retrieval against a flat rules table and recent graph-based data-fusion methods [9,27-29].</w:t>
       </w:r>
     </w:p>
     <w:p>
@@ -2426,7 +2649,7 @@
           <w:rFonts w:ascii="Times New Roman" w:hAnsi="Times New Roman"/>
           <w:sz w:val="22"/>
         </w:rPr>
-        <w:t>The framework is compatible with digital-transformation research. Digital transformation changes organizational capabilities and business models [1], while entrepreneurship research emphasizes how digital technologies change opportunity creation and discovery [2]. Business-model design is tied to dynamic capabilities and the ability to reconfigure resources [9], while innovation portfolios must balance exploration of new possibilities with exploitation of existing knowledge [10]. K-AIDE translates these ideas into a computational task: ranking opportunities under data and knowledge constraints. This translation connects management research to the technical expectations of a knowledge-based AI journal.</w:t>
+        <w:t>The framework is compatible with digital-transformation research. Digital transformation changes organizational capabilities and business models [1,2], while entrepreneurship research emphasizes how digital technologies change opportunity creation and discovery [3]. Business-model design is tied to dynamic capabilities and the ability to reconfigure resources [14], while innovation portfolios must balance exploration of new possibilities with exploitation of existing knowledge [15]. Recent IEEE engineering-management studies likewise connect digital transformation with SME persistence, SME adoption drivers, supply-chain implementation, employee digital literacy, collaborative innovation, exploratory/exploitative innovation, AI-enabled business-model innovation, strategy selection, and new service opportunities [16-22,25,26]. MDPI studies further connect digital capability and entrepreneurial orientation with digital sustainable entrepreneurship and SME value creation [23,24]. K-AIDE translates these ideas into a computational task: ranking opportunities under data and knowledge constraints. This translation connects management research to the technical expectations of a knowledge-based AI journal.</w:t>
       </w:r>
     </w:p>
     <w:p>
@@ -2520,7 +2743,7 @@
         <w:jc w:val="both"/>
       </w:pPr>
       <w:r>
-        <w:t>The benchmark data are synthetic and deterministic. The accompanying code and combined 15,000-record CSV (seeds 42–46) are included for auditability; a public repository identifier is pending and should be added before submission.</w:t>
+        <w:t>The benchmark data are synthetic and deterministic. The accompanying code and combined 15,000-record CSV (seeds 42–46) are included for auditability; The reproducibility package is available at https://github.com/Nithish4603/DBA802.</w:t>
       </w:r>
     </w:p>
     <w:p>
@@ -2576,7 +2799,7 @@
           <w:rFonts w:ascii="Times New Roman" w:hAnsi="Times New Roman"/>
           <w:sz w:val="22"/>
         </w:rPr>
-        <w:t>During preparation of this manuscript and the accompanying demonstration code, generative AI tools were used to assist with drafting, language refinement, and code organization. The author reviewed and edited all content, verified the computational outputs, and takes full responsibility for the accuracy, originality, and integrity of the submitted work. No generative AI tool was used to create or alter primary observed data. The figures are generated deterministically from the supplied Python code.</w:t>
+        <w:t>During preparation of this manuscript and the accompanying demonstration code, generative-AI and AI-assisted tools were used to support manuscript organization, language improvement, technical documentation, and software-development assistance. Publicly available online resources were also consulted for background information, methodological guidance, and implementation support; relevant sources are cited in the manuscript. The author reviewed and edited all AI-assisted material and independently verified the references, dataset construction, code, figures, experimental results, interpretations, and conclusions. The author takes full responsibility for the final content and confirms that no AI system is listed as an author. AI tools were not used to fabricate data, results, or citations. The figures are generated deterministically from the supplied Python code.</w:t>
       </w:r>
     </w:p>
     <w:p>
@@ -2632,35 +2855,7 @@
           <w:rFonts w:ascii="Times New Roman" w:hAnsi="Times New Roman"/>
           <w:sz w:val="22"/>
         </w:rPr>
-        <w:t>Nithish Maley: Conceptualization, Methodology, Software, Validation, Data curation, Formal analysis, Visualization, Writing - original draft, Writing - review and editing.</w:t>
-      </w:r>
-    </w:p>
-    <w:p>
-      <w:pPr>
-        <w:spacing w:line="240" w:lineRule="auto" w:before="240" w:after="80"/>
-        <w:jc w:val="left"/>
-      </w:pPr>
-      <w:r>
-        <w:rPr>
-          <w:rFonts w:ascii="Times New Roman" w:hAnsi="Times New Roman"/>
-          <w:b/>
-          <w:sz w:val="22"/>
-        </w:rPr>
-        <w:t>Acknowledgements</w:t>
-      </w:r>
-    </w:p>
-    <w:p>
-      <w:pPr>
-        <w:spacing w:line="480" w:lineRule="auto" w:after="0"/>
-        <w:ind w:firstLine="360"/>
-        <w:jc w:val="both"/>
-      </w:pPr>
-      <w:r>
-        <w:rPr>
-          <w:rFonts w:ascii="Times New Roman" w:hAnsi="Times New Roman"/>
-          <w:sz w:val="22"/>
-        </w:rPr>
-        <w:t>None.</w:t>
+        <w:t>Nithish Kumar Maley: Conceptualization, Methodology, Software, Validation, Data curation, Formal analysis, Visualization, Writing - original draft, Writing - review and editing.</w:t>
       </w:r>
     </w:p>
     <w:p>
@@ -2679,142 +2874,234 @@
     </w:p>
     <w:p>
       <w:pPr>
-        <w:spacing w:line="240" w:lineRule="auto" w:after="0"/>
-        <w:ind w:firstLine="0"/>
-        <w:jc w:val="left"/>
+        <w:pStyle w:val="Normal"/>
       </w:pPr>
       <w:r>
-        <w:rPr>
-          <w:rFonts w:ascii="Times New Roman" w:hAnsi="Times New Roman"/>
-          <w:sz w:val="21"/>
-        </w:rPr>
-        <w:t>[1] G. Vial, Understanding digital transformation: A review and a research agenda, J. Strateg. Inf. Syst. 28 (2019) 118-144. https://doi.org/10.1016/j.jsis.2019.01.003.</w:t>
+        <w:t>[1] P.C. Verhoef, T. Broekhuizen, Y. Bart, A. Bhattacharya, J.Q. Dong, N. Fabian, M. Haenlein, Digital transformation: A multidisciplinary reflection and research agenda, J. Bus. Res. 122 (2021) 889-901. https://doi.org/10.1016/j.jbusres.2019.09.022.</w:t>
       </w:r>
     </w:p>
     <w:p>
       <w:pPr>
-        <w:spacing w:line="240" w:lineRule="auto" w:after="0"/>
-        <w:ind w:firstLine="0"/>
-        <w:jc w:val="left"/>
+        <w:pStyle w:val="Normal"/>
       </w:pPr>
       <w:r>
-        <w:rPr>
-          <w:rFonts w:ascii="Times New Roman" w:hAnsi="Times New Roman"/>
-          <w:sz w:val="21"/>
-        </w:rPr>
-        <w:t>[2] S. Nambisan, Digital entrepreneurship: Toward a digital technology perspective of entrepreneurship, Entrep. Theory Pract. 41 (2017) 1029-1055. https://doi.org/10.1111/etap.12254.</w:t>
+        <w:t>[2] G. Vial, Understanding digital transformation: A review and a research agenda, J. Strateg. Inf. Syst. 28 (2019) 118-144. https://doi.org/10.1016/j.jsis.2019.01.003.</w:t>
       </w:r>
     </w:p>
     <w:p>
       <w:pPr>
-        <w:spacing w:line="240" w:lineRule="auto" w:after="0"/>
-        <w:ind w:firstLine="0"/>
-        <w:jc w:val="left"/>
+        <w:pStyle w:val="Normal"/>
       </w:pPr>
       <w:r>
-        <w:rPr>
-          <w:rFonts w:ascii="Times New Roman" w:hAnsi="Times New Roman"/>
-          <w:sz w:val="21"/>
-        </w:rPr>
-        <w:t>[3] S. Raisch, S. Krakowski, Artificial intelligence and management: The automation-augmentation paradox, Acad. Manag. Rev. 46 (2021) 192-210. https://doi.org/10.5465/amr.2018.0072.</w:t>
+        <w:t>[3] S. Nambisan, Digital entrepreneurship: Toward a digital technology perspective of entrepreneurship, Entrep. Theory Pract. 41 (2017) 1029-1055. https://doi.org/10.1111/etap.12254.</w:t>
       </w:r>
     </w:p>
     <w:p>
       <w:pPr>
-        <w:spacing w:line="240" w:lineRule="auto" w:after="0"/>
-        <w:ind w:firstLine="0"/>
-        <w:jc w:val="left"/>
+        <w:pStyle w:val="Normal"/>
       </w:pPr>
       <w:r>
-        <w:rPr>
-          <w:rFonts w:ascii="Times New Roman" w:hAnsi="Times New Roman"/>
-          <w:sz w:val="21"/>
-        </w:rPr>
-        <w:t>[4] M.T. Ribeiro, S. Singh, C. Guestrin, Why should I trust you? Explaining the predictions of any classifier, in: Proceedings of the 22nd ACM SIGKDD International Conference on Knowledge Discovery and Data Mining, ACM, 2016, pp. 1135-1144. https://doi.org/10.1145/2939672.2939778.</w:t>
+        <w:t>[4] S. Raisch, S. Krakowski, Artificial intelligence and management: The automation-augmentation paradox, Acad. Manag. Rev. 46 (2021) 192-210. https://doi.org/10.5465/amr.2018.0072.</w:t>
       </w:r>
     </w:p>
     <w:p>
       <w:pPr>
-        <w:spacing w:line="240" w:lineRule="auto" w:after="0"/>
-        <w:ind w:firstLine="0"/>
-        <w:jc w:val="left"/>
+        <w:pStyle w:val="Normal"/>
       </w:pPr>
       <w:r>
-        <w:rPr>
-          <w:rFonts w:ascii="Times New Roman" w:hAnsi="Times New Roman"/>
-          <w:sz w:val="21"/>
-        </w:rPr>
-        <w:t>[5] L. Breiman, Random forests, Mach. Learn. 45 (2001) 5-32. https://doi.org/10.1023/A:1010933404324.</w:t>
+        <w:t>[5] Y. Duan, J.S. Edwards, Y.K. Dwivedi, Artificial intelligence for decision making in the era of Big Data-evolution, challenges and research agenda, Int. J. Inf. Manag. 48 (2019) 63-71. https://doi.org/10.1016/j.ijinfomgt.2019.01.021.</w:t>
       </w:r>
     </w:p>
     <w:p>
       <w:pPr>
-        <w:spacing w:line="240" w:lineRule="auto" w:after="0"/>
-        <w:ind w:firstLine="0"/>
-        <w:jc w:val="left"/>
+        <w:pStyle w:val="Normal"/>
       </w:pPr>
       <w:r>
-        <w:rPr>
-          <w:rFonts w:ascii="Times New Roman" w:hAnsi="Times New Roman"/>
-          <w:sz w:val="21"/>
-        </w:rPr>
-        <w:t>[6] P. Mikalef, M. Gupta, Artificial intelligence capability: Conceptualization, measurement calibration, and empirical study on its impact on organizational creativity and firm performance, Inf. Manag. 58 (2021) 103434. https://doi.org/10.1016/j.im.2021.103434.</w:t>
+        <w:t>[6] S.M.C. Loureiro, J. Guerreiro, I. Tussyadiah, Artificial intelligence in business: State of the art and future research agenda, J. Bus. Res. 129 (2021) 911-926. https://doi.org/10.1016/j.jbusres.2020.11.001.</w:t>
       </w:r>
     </w:p>
     <w:p>
       <w:pPr>
-        <w:spacing w:line="240" w:lineRule="auto" w:after="0"/>
-        <w:ind w:firstLine="0"/>
-        <w:jc w:val="left"/>
+        <w:pStyle w:val="Normal"/>
       </w:pPr>
       <w:r>
-        <w:rPr>
-          <w:rFonts w:ascii="Times New Roman" w:hAnsi="Times New Roman"/>
-          <w:sz w:val="21"/>
-        </w:rPr>
-        <w:t>[7] G. Shmueli, O.R. Koppius, Predictive analytics in information systems research, MIS Q. 35 (2011) 553-572. https://doi.org/10.2307/23042796.</w:t>
+        <w:t>[7] P. Mikalef, M. Gupta, Artificial intelligence capability: Conceptualization, measurement calibration, and empirical study on its impact on organizational creativity and firm performance, Inf. Manag. 58 (2021) 103434. https://doi.org/10.1016/j.im.2021.103434.</w:t>
       </w:r>
     </w:p>
     <w:p>
       <w:pPr>
-        <w:spacing w:line="240" w:lineRule="auto" w:after="0"/>
-        <w:ind w:firstLine="0"/>
-        <w:jc w:val="left"/>
+        <w:pStyle w:val="Normal"/>
       </w:pPr>
       <w:r>
-        <w:rPr>
-          <w:rFonts w:ascii="Times New Roman" w:hAnsi="Times New Roman"/>
-          <w:sz w:val="21"/>
-        </w:rPr>
-        <w:t>[8] C. Rudin, Stop explaining black box machine learning models for high stakes decisions and use interpretable models instead, Nat. Mach. Intell. 1 (2019) 206-215. https://doi.org/10.1038/s42256-019-0048-x.</w:t>
+        <w:t>[8] A.B. Arrieta, N. Díaz-Rodríguez, J. Del Ser, A. Bennetot, S. Tabik, A. Barbado, S. Garcia, S. Gil-Lopez, D. Molina, R. Benjamins, R. Chatila, F. Herrera, Explainable artificial intelligence (XAI): Concepts, taxonomies, opportunities and challenges toward responsible AI, Inf. Fusion 58 (2020) 82-115. https://doi.org/10.1016/j.inffus.2019.12.012.</w:t>
       </w:r>
     </w:p>
     <w:p>
       <w:pPr>
-        <w:spacing w:line="240" w:lineRule="auto" w:after="0"/>
-        <w:ind w:firstLine="0"/>
-        <w:jc w:val="left"/>
+        <w:pStyle w:val="Normal"/>
       </w:pPr>
       <w:r>
-        <w:rPr>
-          <w:rFonts w:ascii="Times New Roman" w:hAnsi="Times New Roman"/>
-          <w:sz w:val="21"/>
-        </w:rPr>
-        <w:t>[9] D.J. Teece, Business models and dynamic capabilities, Long Range Plann. 51 (2018) 40-49. https://doi.org/10.1016/j.lrp.2017.06.007.</w:t>
+        <w:t>[9] I. Tiddi, S. Schlobach, Knowledge graphs as tools for explainable machine learning: A survey, Artif. Intell. 302 (2022) 103627. https://doi.org/10.1016/j.artint.2021.103627.</w:t>
       </w:r>
     </w:p>
     <w:p>
       <w:pPr>
-        <w:spacing w:line="240" w:lineRule="auto" w:after="0"/>
-        <w:ind w:firstLine="0"/>
-        <w:jc w:val="left"/>
+        <w:pStyle w:val="Normal"/>
       </w:pPr>
       <w:r>
-        <w:rPr>
-          <w:rFonts w:ascii="Times New Roman" w:hAnsi="Times New Roman"/>
-          <w:sz w:val="21"/>
-        </w:rPr>
-        <w:t>[10] J.G. March, Exploration and exploitation in organizational learning, Organ. Sci. 2 (1991) 71-87. https://doi.org/10.1287/orsc.2.1.71.</w:t>
+        <w:t>[10] K. Coussement, M.Z. Abedin, M. Kraus, S. Maldonado, K. Topuz, Explainable AI for enhanced decision-making, Decis. Support Syst. 184 (2024) 114276. https://doi.org/10.1016/j.dss.2024.114276.</w:t>
+      </w:r>
+    </w:p>
+    <w:p>
+      <w:pPr>
+        <w:pStyle w:val="Normal"/>
+      </w:pPr>
+      <w:r>
+        <w:t>[11] C. Rudin, Stop explaining black box machine learning models for high stakes decisions and use interpretable models instead, Nat. Mach. Intell. 1 (2019) 206-215. https://doi.org/10.1038/s42256-019-0048-x.</w:t>
+      </w:r>
+    </w:p>
+    <w:p>
+      <w:pPr>
+        <w:pStyle w:val="Normal"/>
+      </w:pPr>
+      <w:r>
+        <w:t>[12] L. Breiman, Random forests, Mach. Learn. 45 (2001) 5-32. https://doi.org/10.1023/A:1010933404324.</w:t>
+      </w:r>
+    </w:p>
+    <w:p>
+      <w:pPr>
+        <w:pStyle w:val="Normal"/>
+      </w:pPr>
+      <w:r>
+        <w:t>[13] G. Shmueli, O.R. Koppius, Predictive analytics in information systems research, MIS Q. 35 (2011) 553-572. https://doi.org/10.2307/23042796.</w:t>
+      </w:r>
+    </w:p>
+    <w:p>
+      <w:pPr>
+        <w:pStyle w:val="Normal"/>
+      </w:pPr>
+      <w:r>
+        <w:t>[14] D.J. Teece, Business models and dynamic capabilities, Long Range Plann. 51 (2018) 40-49. https://doi.org/10.1016/j.lrp.2017.06.007.</w:t>
+      </w:r>
+    </w:p>
+    <w:p>
+      <w:pPr>
+        <w:pStyle w:val="Normal"/>
+      </w:pPr>
+      <w:r>
+        <w:t>[15] J.G. March, Exploration and exploitation in organizational learning, Organ. Sci. 2 (1991) 71-87. https://doi.org/10.1287/orsc.2.1.71.</w:t>
+      </w:r>
+    </w:p>
+    <w:p>
+      <w:pPr>
+        <w:pStyle w:val="Normal"/>
+      </w:pPr>
+      <w:r>
+        <w:t>[16] M. Christofi, H. Khan, N. Zahoor, E. Hadjielias, S. Tarba, Digital transformation of SMEs: The role of entrepreneurial persistence and market sensing dynamic capability, IEEE Trans. Eng. Manag. 71 (2024) 13598-13615. https://doi.org/10.1109/TEM.2022.3230248.</w:t>
+      </w:r>
+    </w:p>
+    <w:p>
+      <w:pPr>
+        <w:pStyle w:val="Normal"/>
+      </w:pPr>
+      <w:r>
+        <w:t>[17] N. Omrani, N. Rejeb, A. Maalaoui, M. Dabić, S. Kraus, Drivers of digital transformation in SMEs, IEEE Trans. Eng. Manag. 71 (2024) 5030-5043. https://doi.org/10.1109/TEM.2022.3215727.</w:t>
+      </w:r>
+    </w:p>
+    <w:p>
+      <w:pPr>
+        <w:pStyle w:val="Normal"/>
+      </w:pPr>
+      <w:r>
+        <w:t>[18] H. Birkel, M. Wehrle, Small- and medium-sized companies tackling the digital transformation of supply chain processes: Insights from a multiple case study in the German manufacturing industry, IEEE Trans. Eng. Manag. 71 (2024) 13711-13726. https://doi.org/10.1109/TEM.2022.3209131.</w:t>
+      </w:r>
+    </w:p>
+    <w:p>
+      <w:pPr>
+        <w:pStyle w:val="Normal"/>
+      </w:pPr>
+      <w:r>
+        <w:t>[19] D. Cetindamar, B. Abedin, K. Shirahada, The role of employees in digital transformation: A preliminary study on how employees’ digital literacy impacts use of digital technologies, IEEE Trans. Eng. Manag. 71 (2024) 7837-7848. https://doi.org/10.1109/TEM.2021.3087724.</w:t>
+      </w:r>
+    </w:p>
+    <w:p>
+      <w:pPr>
+        <w:pStyle w:val="Normal"/>
+      </w:pPr>
+      <w:r>
+        <w:t>[20] J. Shi, Z. Jiang, Z. Liu, Digital technology adoption and collaborative innovation in Chinese high-speed rail industry: Does organizational agility matter? IEEE Trans. Eng. Manag. 71 (2024) 4322-4335. https://doi.org/10.1109/TEM.2022.3232718.</w:t>
+      </w:r>
+    </w:p>
+    <w:p>
+      <w:pPr>
+        <w:pStyle w:val="Normal"/>
+      </w:pPr>
+      <w:r>
+        <w:t>[21] R. Liang, Y. Li, How digital transformation affects exploitative and exploratory innovation: An innovation structure perspective, IEEE Trans. Eng. Manag. 71 (2024) 10912-10923. https://doi.org/10.1109/TEM.2024.3408322.</w:t>
+      </w:r>
+    </w:p>
+    <w:p>
+      <w:pPr>
+        <w:pStyle w:val="Normal"/>
+      </w:pPr>
+      <w:r>
+        <w:t>[22] H. Kumar, Enablers for digital transformation of services to harness new business opportunities, IEEE Trans. Eng. Manag. 71 (2024) 14282-14292. https://doi.org/10.1109/TEM.2024.3437733.</w:t>
+      </w:r>
+    </w:p>
+    <w:p>
+      <w:pPr>
+        <w:pStyle w:val="Normal"/>
+      </w:pPr>
+      <w:r>
+        <w:t>[23] D. Vrontis, R. Chaudhuri, S. Chatterjee, Adoption of digital technologies by SMEs for sustainability and value creation: Moderating role of entrepreneurial orientation, Sustainability 14 (2022) 7949. https://doi.org/10.3390/su14137949.</w:t>
+      </w:r>
+    </w:p>
+    <w:p>
+      <w:pPr>
+        <w:pStyle w:val="Normal"/>
+      </w:pPr>
+      <w:r>
+        <w:t>[24] G. Xu, G. Hou, J. Zhang, Digital sustainable entrepreneurship: A digital capability perspective through digital innovation orientation for social and environmental value creation, Sustainability 14 (2022) 11222. https://doi.org/10.3390/su141811222.</w:t>
+      </w:r>
+    </w:p>
+    <w:p>
+      <w:pPr>
+        <w:pStyle w:val="Normal"/>
+      </w:pPr>
+      <w:r>
+        <w:t>[25] P. Jorzik, A. Yigit, D.K. Kanbach, S. Kraus, M. Dabić, Artificial intelligence-enabled business model innovation: Competencies and roles of top management, IEEE Trans. Eng. Manag. 71 (2024) 7044-7056. https://doi.org/10.1109/TEM.2023.3275643.</w:t>
+      </w:r>
+    </w:p>
+    <w:p>
+      <w:pPr>
+        <w:pStyle w:val="Normal"/>
+      </w:pPr>
+      <w:r>
+        <w:t>[26] Y. Zhou, D.J. Xu, Z. Liu, J. Feng, Digital transformation and innovation strategy selection: The contingent impact of organizational and environmental factors, IEEE Trans. Eng. Manag. 71 (2024) 9744-9763. https://doi.org/10.1109/TEM.2023.3325878.</w:t>
+      </w:r>
+    </w:p>
+    <w:p>
+      <w:pPr>
+        <w:pStyle w:val="Normal"/>
+      </w:pPr>
+      <w:r>
+        <w:t>[27] L. Huang, X. Pan, Y. Liu, L. Gong, An unsupervised machine learning approach for monitoring data fusion and health indicator construction, Sensors 23 (2023) 7239. https://doi.org/10.3390/s23167239.</w:t>
+      </w:r>
+    </w:p>
+    <w:p>
+      <w:pPr>
+        <w:pStyle w:val="Normal"/>
+      </w:pPr>
+      <w:r>
+        <w:t>[28] H. Zhou, Y. Zhao, Y. Liu, S. Lu, X. An, Q. Liu, Multi-sensor data fusion and CNN-LSTM model for human activity recognition system, Sensors 23 (2023) 4750. https://doi.org/10.3390/s23104750.</w:t>
+      </w:r>
+    </w:p>
+    <w:p>
+      <w:pPr>
+        <w:pStyle w:val="Normal"/>
+      </w:pPr>
+      <w:r>
+        <w:t>[29] X. Xie, J. Wang, Y. Han, W. Li, Knowledge graph-based in-context learning for advanced fault diagnosis in sensor networks, Sensors 24 (2024) 8086. https://doi.org/10.3390/s24248086.</w:t>
       </w:r>
     </w:p>
     <w:sectPr>

</xml_diff>